<commit_message>
cleanup : gitignore + outputs belgique
</commit_message>
<xml_diff>
--- a/pays/belgique/outputs/MAB_Belgique_Annexes.docx
+++ b/pays/belgique/outputs/MAB_Belgique_Annexes.docx
@@ -8,7 +8,7 @@
         <w:jc w:val="center"/>
       </w:pPr>
       <w:r>
-        <w:t>MAB BELGIQUE — ANNEXES &amp; SOURCES v3</w:t>
+        <w:t>MAB BELGIQUE — ANNEXES &amp; SOURCES v5</w:t>
       </w:r>
     </w:p>
     <w:p>
@@ -41,7 +41,7 @@
         <w:rPr>
           <w:i/>
         </w:rPr>
-        <w:t>Toutes les sources consultées pour MAB_Belgique_Etude.docx v3 :</w:t>
+        <w:t>Toutes les sources consultées pour MAB_Belgique_Etude.docx v5 :</w:t>
       </w:r>
     </w:p>
     <w:p/>

</xml_diff>